<commit_message>
Domanda: righe tabella servizi singole, doppie solo se scontate
Nel template della domanda (IT e EN) il ritorno a capo del run verde
SCONTO/PREZZO RISERVATO stava FUORI dal blocco {% if %}: il testo spariva
ma il br restava, quindi bastava una riga scontata perche TUTTE le righe
della tabella avessero una seconda riga vuota (altezza doppia).

Ora il run (br compreso) e avvolto in {%r if ln.is_prezzo_revisionato %}
/ {%r endif %}: le righe a prezzo pieno restano su una riga singola, solo
quelle scontate vanno su due. Test di regressione end-to-end sul docx
generato. Gli altri template non avevano il difetto.
</commit_message>
<xml_diff>
--- a/contracts/templates_pdf/template_domanda_ammissione_en.docx
+++ b/contracts/templates_pdf/template_domanda_ammissione_en.docx
@@ -1032,6 +1032,9 @@
               <w:t xml:space="preserve">{{ ln.service_name_snapshot }}{% if ln.variant_label_snapshot %} – {{ ln.variant_label_snapshot }}{% endif %}</w:t>
             </w:r>
             <w:r>
+              <w:t>{%r if ln.is_prezzo_revisionato %}</w:t>
+            </w:r>
+            <w:r>
               <w:rPr>
                 <w:rFonts w:ascii="Arial" w:hAnsi="Arial" w:cs="Arial"/>
                 <w:b/>
@@ -1039,7 +1042,10 @@
                 <w:sz w:val="18"/>
               </w:rPr>
               <w:br/>
-              <w:t xml:space="preserve">{% if ln.is_prezzo_revisionato %}{% if ln.is_sconto_esplicito %}RESERVED DISCOUNT € {{ ln.sconto_eur|format_currency }}{% else %}RESERVED PRICE € {{ ln.prezzo_riservato|format_currency }}{% endif %}{% endif %}</w:t>
+              <w:t xml:space="preserve">{% if ln.is_sconto_esplicito %}RESERVED DISCOUNT € {{ ln.sconto_eur|format_currency }}{% else %}RESERVED PRICE € {{ ln.prezzo_riservato|format_currency }}{% endif %}</w:t>
+            </w:r>
+            <w:r>
+              <w:t>{%r endif %}</w:t>
             </w:r>
           </w:p>
         </w:tc>

</xml_diff>

<commit_message>
Contratto: clausola saldo segue il metodo di pagamento (RI.BA. usa termini liberi)
Aggiunta la scelta RI.BA. a Contract.payment_method e la property payment_clause_text: se il metodo è RI.BA. il contratto/domanda di ammissione riporta i termini liberi (es. '60 gg F.M.') invece della valuta fissa alla scadenza saldo. Aggiornati i template IT/EN.
</commit_message>
<xml_diff>
--- a/contracts/templates_pdf/template_domanda_ammissione_en.docx
+++ b/contracts/templates_pdf/template_domanda_ammissione_en.docx
@@ -1720,7 +1720,7 @@
           <w:sz w:val="20"/>
           <w:szCs w:val="20"/>
         </w:rPr>
-        <w:t xml:space="preserve">{% endif %}BALANCE: €</w:t>
+        <w:t>{% endif %}</w:t>
       </w:r>
       <w:r>
         <w:rPr>
@@ -1731,7 +1731,6 @@
           <w:sz w:val="20"/>
           <w:szCs w:val="20"/>
         </w:rPr>
-        <w:t xml:space="preserve"> </w:t>
       </w:r>
       <w:r>
         <w:rPr>
@@ -1743,7 +1742,6 @@
           <w:sz w:val="20"/>
           <w:szCs w:val="20"/>
         </w:rPr>
-        <w:t xml:space="preserve">{{ contract.balance_amount|format_currency }}</w:t>
       </w:r>
       <w:r>
         <w:rPr>
@@ -1753,7 +1751,6 @@
           <w:sz w:val="20"/>
           <w:szCs w:val="20"/>
         </w:rPr>
-        <w:t xml:space="preserve"> </w:t>
       </w:r>
       <w:r>
         <w:rPr>
@@ -1763,7 +1760,7 @@
           <w:sz w:val="20"/>
           <w:szCs w:val="20"/>
         </w:rPr>
-        <w:t xml:space="preserve">to be paid with fixed value date on {{ contract.balance_due_date|format_date|default('___________', true) }}.</w:t>
+        <w:t>{{ contract.payment_clause_text }}</w:t>
       </w:r>
     </w:p>
     <w:p>

</xml_diff>

<commit_message>
Stand: campo Note per lo sponsor (IT/EN) stampato nel preventivo e nella domanda/contratto, separato dalle note interne; colonna note_sponsor nel modello Excel e nell'import; ordinamento naturale dei codici stand (prefisso poi numero); manuali aggiornati
</commit_message>
<xml_diff>
--- a/contracts/templates_pdf/template_domanda_ammissione_en.docx
+++ b/contracts/templates_pdf/template_domanda_ammissione_en.docx
@@ -1437,6 +1437,42 @@
         </w:tc>
       </w:tr>
     </w:tbl>
+    <w:p/>
+    <w:p>
+      <w:r>
+        <w:rPr>
+          <w:rFonts w:ascii="Arial" w:hAnsi="Arial"/>
+          <w:sz w:val="18"/>
+        </w:rPr>
+        <w:t xml:space="preserve">{%p if stand_notes %}</w:t>
+      </w:r>
+    </w:p>
+    <w:p>
+      <w:r>
+        <w:rPr>
+          <w:rFonts w:ascii="Arial" w:hAnsi="Arial"/>
+          <w:sz w:val="18"/>
+          <w:b/>
+        </w:rPr>
+        <w:t xml:space="preserve">Exhibition space notes: </w:t>
+      </w:r>
+      <w:r>
+        <w:rPr>
+          <w:rFonts w:ascii="Arial" w:hAnsi="Arial"/>
+          <w:sz w:val="18"/>
+        </w:rPr>
+        <w:t xml:space="preserve">{{ stand_notes }}</w:t>
+      </w:r>
+    </w:p>
+    <w:p>
+      <w:r>
+        <w:rPr>
+          <w:rFonts w:ascii="Arial" w:hAnsi="Arial"/>
+          <w:sz w:val="18"/>
+        </w:rPr>
+        <w:t xml:space="preserve">{%p endif %}</w:t>
+      </w:r>
+    </w:p>
     <w:p>
       <w:pPr>
         <w:autoSpaceDE w:val="0"/>

</xml_diff>